<commit_message>
Activated WSR TP amnd KPI reports and added templates.docx
</commit_message>
<xml_diff>
--- a/static/report_templates/DTR_Template.docx
+++ b/static/report_templates/DTR_Template.docx
@@ -128,6 +128,14 @@
     <w:p>
       <w:pPr>
         <w:pStyle w:val="Normal"/>
+        <w:rPr>
+          <w:rFonts w:ascii="Calibri" w:hAnsi="Calibri" w:asciiTheme="minorAscii" w:hAnsiTheme="minorAscii"/>
+          <w:b w:val="0"/>
+          <w:bCs w:val="0"/>
+          <w:sz w:val="20"/>
+          <w:szCs w:val="20"/>
+          <w:highlight w:val="green"/>
+        </w:rPr>
       </w:pPr>
       <w:r>
         <w:rPr>
@@ -136,8 +144,53 @@
           <w:bCs w:val="0"/>
           <w:sz w:val="20"/>
           <w:szCs w:val="20"/>
+          <w:highlight w:val="green"/>
         </w:rPr>
-        <w:t>{{ target_date }} {{ day_of_week }}</w:t>
+        <w:t xml:space="preserve">{{ </w:t>
+      </w:r>
+      <w:r>
+        <w:rPr>
+          <w:rFonts w:ascii="Calibri" w:hAnsi="Calibri" w:asciiTheme="minorAscii" w:hAnsiTheme="minorAscii"/>
+          <w:b w:val="0"/>
+          <w:bCs w:val="0"/>
+          <w:sz w:val="20"/>
+          <w:szCs w:val="20"/>
+          <w:highlight w:val="green"/>
+        </w:rPr>
+        <w:t>target_date</w:t>
+      </w:r>
+      <w:r>
+        <w:rPr>
+          <w:rFonts w:ascii="Calibri" w:hAnsi="Calibri" w:asciiTheme="minorAscii" w:hAnsiTheme="minorAscii"/>
+          <w:b w:val="0"/>
+          <w:bCs w:val="0"/>
+          <w:sz w:val="20"/>
+          <w:szCs w:val="20"/>
+          <w:highlight w:val="green"/>
+        </w:rPr>
+        <w:t xml:space="preserve"> }} {{ </w:t>
+      </w:r>
+      <w:r>
+        <w:rPr>
+          <w:rFonts w:ascii="Calibri" w:hAnsi="Calibri" w:asciiTheme="minorAscii" w:hAnsiTheme="minorAscii"/>
+          <w:b w:val="0"/>
+          <w:bCs w:val="0"/>
+          <w:sz w:val="20"/>
+          <w:szCs w:val="20"/>
+          <w:highlight w:val="green"/>
+        </w:rPr>
+        <w:t>day_of_week</w:t>
+      </w:r>
+      <w:r>
+        <w:rPr>
+          <w:rFonts w:ascii="Calibri" w:hAnsi="Calibri" w:asciiTheme="minorAscii" w:hAnsiTheme="minorAscii"/>
+          <w:b w:val="0"/>
+          <w:bCs w:val="0"/>
+          <w:sz w:val="20"/>
+          <w:szCs w:val="20"/>
+          <w:highlight w:val="green"/>
+        </w:rPr>
+        <w:t xml:space="preserve"> }}</w:t>
       </w:r>
     </w:p>
     <w:p>
@@ -228,16 +281,63 @@
     <w:p>
       <w:pPr>
         <w:pStyle w:val="Normal"/>
+        <w:rPr>
+          <w:rFonts w:ascii="Calibri" w:hAnsi="Calibri" w:asciiTheme="minorAscii" w:hAnsiTheme="minorAscii"/>
+          <w:b w:val="1"/>
+          <w:bCs w:val="1"/>
+          <w:sz w:val="20"/>
+          <w:szCs w:val="20"/>
+        </w:rPr>
       </w:pPr>
       <w:r>
         <w:rPr>
           <w:rFonts w:ascii="Calibri" w:hAnsi="Calibri" w:asciiTheme="minorAscii" w:hAnsiTheme="minorAscii"/>
-          <w:b w:val="0"/>
-          <w:bCs w:val="0"/>
+          <w:b w:val="1"/>
+          <w:bCs w:val="1"/>
           <w:sz w:val="20"/>
           <w:szCs w:val="20"/>
         </w:rPr>
-        <w:t>{{ block.title }}: {{ block.surveyors }}</w:t>
+        <w:t xml:space="preserve">{{ </w:t>
+      </w:r>
+      <w:r>
+        <w:rPr>
+          <w:rFonts w:ascii="Calibri" w:hAnsi="Calibri" w:asciiTheme="minorAscii" w:hAnsiTheme="minorAscii"/>
+          <w:b w:val="1"/>
+          <w:bCs w:val="1"/>
+          <w:sz w:val="20"/>
+          <w:szCs w:val="20"/>
+        </w:rPr>
+        <w:t>block.title</w:t>
+      </w:r>
+      <w:r>
+        <w:rPr>
+          <w:rFonts w:ascii="Calibri" w:hAnsi="Calibri" w:asciiTheme="minorAscii" w:hAnsiTheme="minorAscii"/>
+          <w:b w:val="1"/>
+          <w:bCs w:val="1"/>
+          <w:sz w:val="20"/>
+          <w:szCs w:val="20"/>
+        </w:rPr>
+        <w:t xml:space="preserve"> }}: {{ </w:t>
+      </w:r>
+      <w:r>
+        <w:rPr>
+          <w:rFonts w:ascii="Calibri" w:hAnsi="Calibri" w:asciiTheme="minorAscii" w:hAnsiTheme="minorAscii"/>
+          <w:b w:val="1"/>
+          <w:bCs w:val="1"/>
+          <w:sz w:val="20"/>
+          <w:szCs w:val="20"/>
+        </w:rPr>
+        <w:t>block.surveyors</w:t>
+      </w:r>
+      <w:r>
+        <w:rPr>
+          <w:rFonts w:ascii="Calibri" w:hAnsi="Calibri" w:asciiTheme="minorAscii" w:hAnsiTheme="minorAscii"/>
+          <w:b w:val="1"/>
+          <w:bCs w:val="1"/>
+          <w:sz w:val="20"/>
+          <w:szCs w:val="20"/>
+        </w:rPr>
+        <w:t xml:space="preserve"> }}</w:t>
       </w:r>
     </w:p>
     <w:p>
@@ -303,31 +403,85 @@
     <w:p>
       <w:pPr>
         <w:pStyle w:val="Normal"/>
+        <w:rPr>
+          <w:rFonts w:ascii="Calibri" w:hAnsi="Calibri" w:asciiTheme="minorAscii" w:hAnsiTheme="minorAscii"/>
+          <w:b w:val="1"/>
+          <w:bCs w:val="1"/>
+          <w:sz w:val="20"/>
+          <w:szCs w:val="20"/>
+        </w:rPr>
       </w:pPr>
       <w:r>
         <w:rPr>
           <w:rFonts w:ascii="Calibri" w:hAnsi="Calibri" w:asciiTheme="minorAscii" w:hAnsiTheme="minorAscii"/>
-          <w:b w:val="0"/>
-          <w:bCs w:val="0"/>
+          <w:b w:val="1"/>
+          <w:bCs w:val="1"/>
           <w:sz w:val="20"/>
           <w:szCs w:val="20"/>
         </w:rPr>
-        <w:t>Survey Boat: {{ block.boat }}</w:t>
+        <w:t xml:space="preserve">Survey Boat: {{ </w:t>
+      </w:r>
+      <w:r>
+        <w:rPr>
+          <w:rFonts w:ascii="Calibri" w:hAnsi="Calibri" w:asciiTheme="minorAscii" w:hAnsiTheme="minorAscii"/>
+          <w:b w:val="1"/>
+          <w:bCs w:val="1"/>
+          <w:sz w:val="20"/>
+          <w:szCs w:val="20"/>
+        </w:rPr>
+        <w:t>block.boat</w:t>
+      </w:r>
+      <w:r>
+        <w:rPr>
+          <w:rFonts w:ascii="Calibri" w:hAnsi="Calibri" w:asciiTheme="minorAscii" w:hAnsiTheme="minorAscii"/>
+          <w:b w:val="1"/>
+          <w:bCs w:val="1"/>
+          <w:sz w:val="20"/>
+          <w:szCs w:val="20"/>
+        </w:rPr>
+        <w:t xml:space="preserve"> }}</w:t>
       </w:r>
     </w:p>
     <w:p>
       <w:pPr>
         <w:pStyle w:val="Normal"/>
+        <w:rPr>
+          <w:rFonts w:ascii="Calibri" w:hAnsi="Calibri" w:asciiTheme="minorAscii" w:hAnsiTheme="minorAscii"/>
+          <w:b w:val="1"/>
+          <w:bCs w:val="1"/>
+          <w:sz w:val="20"/>
+          <w:szCs w:val="20"/>
+        </w:rPr>
       </w:pPr>
       <w:r>
         <w:rPr>
           <w:rFonts w:ascii="Calibri" w:hAnsi="Calibri" w:asciiTheme="minorAscii" w:hAnsiTheme="minorAscii"/>
-          <w:b w:val="0"/>
-          <w:bCs w:val="0"/>
+          <w:b w:val="1"/>
+          <w:bCs w:val="1"/>
           <w:sz w:val="20"/>
           <w:szCs w:val="20"/>
         </w:rPr>
-        <w:t>Surveyor: {{ block.surveyors }}</w:t>
+        <w:t xml:space="preserve">Surveyor: {{ </w:t>
+      </w:r>
+      <w:r>
+        <w:rPr>
+          <w:rFonts w:ascii="Calibri" w:hAnsi="Calibri" w:asciiTheme="minorAscii" w:hAnsiTheme="minorAscii"/>
+          <w:b w:val="1"/>
+          <w:bCs w:val="1"/>
+          <w:sz w:val="20"/>
+          <w:szCs w:val="20"/>
+        </w:rPr>
+        <w:t>block.surveyors</w:t>
+      </w:r>
+      <w:r>
+        <w:rPr>
+          <w:rFonts w:ascii="Calibri" w:hAnsi="Calibri" w:asciiTheme="minorAscii" w:hAnsiTheme="minorAscii"/>
+          <w:b w:val="1"/>
+          <w:bCs w:val="1"/>
+          <w:sz w:val="20"/>
+          <w:szCs w:val="20"/>
+        </w:rPr>
+        <w:t xml:space="preserve"> }}</w:t>
       </w:r>
     </w:p>
     <w:p>
@@ -393,16 +547,43 @@
     <w:p>
       <w:pPr>
         <w:pStyle w:val="Normal"/>
+        <w:rPr>
+          <w:rFonts w:ascii="Calibri" w:hAnsi="Calibri" w:asciiTheme="minorAscii" w:hAnsiTheme="minorAscii"/>
+          <w:b w:val="1"/>
+          <w:bCs w:val="1"/>
+          <w:sz w:val="20"/>
+          <w:szCs w:val="20"/>
+        </w:rPr>
       </w:pPr>
       <w:r>
         <w:rPr>
           <w:rFonts w:ascii="Calibri" w:hAnsi="Calibri" w:asciiTheme="minorAscii" w:hAnsiTheme="minorAscii"/>
-          <w:b w:val="0"/>
-          <w:bCs w:val="0"/>
+          <w:b w:val="1"/>
+          <w:bCs w:val="1"/>
           <w:sz w:val="20"/>
           <w:szCs w:val="20"/>
         </w:rPr>
-        <w:t>Survey Personnel: {{ block.surveyors }}</w:t>
+        <w:t xml:space="preserve">Survey Personnel: {{ </w:t>
+      </w:r>
+      <w:r>
+        <w:rPr>
+          <w:rFonts w:ascii="Calibri" w:hAnsi="Calibri" w:asciiTheme="minorAscii" w:hAnsiTheme="minorAscii"/>
+          <w:b w:val="1"/>
+          <w:bCs w:val="1"/>
+          <w:sz w:val="20"/>
+          <w:szCs w:val="20"/>
+        </w:rPr>
+        <w:t>block.surveyors</w:t>
+      </w:r>
+      <w:r>
+        <w:rPr>
+          <w:rFonts w:ascii="Calibri" w:hAnsi="Calibri" w:asciiTheme="minorAscii" w:hAnsiTheme="minorAscii"/>
+          <w:b w:val="1"/>
+          <w:bCs w:val="1"/>
+          <w:sz w:val="20"/>
+          <w:szCs w:val="20"/>
+        </w:rPr>
+        <w:t xml:space="preserve"> }}</w:t>
       </w:r>
     </w:p>
     <w:p>
@@ -463,6 +644,103 @@
           <w:szCs w:val="20"/>
         </w:rPr>
         <w:t>No survey tasks logged for this date.</w:t>
+      </w:r>
+    </w:p>
+    <w:p>
+      <w:pPr>
+        <w:pStyle w:val="Normal"/>
+      </w:pPr>
+      <w:r>
+        <w:rPr>
+          <w:rFonts w:ascii="Calibri" w:hAnsi="Calibri" w:asciiTheme="minorAscii" w:hAnsiTheme="minorAscii"/>
+          <w:b w:val="0"/>
+          <w:bCs w:val="0"/>
+          <w:sz w:val="20"/>
+          <w:szCs w:val="20"/>
+        </w:rPr>
+        <w:t>{% endif %}</w:t>
+      </w:r>
+    </w:p>
+    <w:p>
+      <w:pPr>
+        <w:pStyle w:val="Normal"/>
+        <w:rPr>
+          <w:rFonts w:ascii="Calibri" w:hAnsi="Calibri" w:asciiTheme="minorAscii" w:hAnsiTheme="minorAscii"/>
+          <w:b w:val="1"/>
+          <w:bCs w:val="1"/>
+          <w:sz w:val="20"/>
+          <w:szCs w:val="20"/>
+        </w:rPr>
+      </w:pPr>
+      <w:r>
+        <w:rPr>
+          <w:rFonts w:ascii="Calibri" w:hAnsi="Calibri" w:asciiTheme="minorAscii" w:hAnsiTheme="minorAscii"/>
+          <w:b w:val="1"/>
+          <w:bCs w:val="1"/>
+          <w:sz w:val="20"/>
+          <w:szCs w:val="20"/>
+        </w:rPr>
+        <w:t>Outstanding Actions</w:t>
+      </w:r>
+    </w:p>
+    <w:p>
+      <w:pPr>
+        <w:pStyle w:val="Normal"/>
+      </w:pPr>
+      <w:r>
+        <w:rPr>
+          <w:rFonts w:ascii="Calibri" w:hAnsi="Calibri" w:asciiTheme="minorAscii" w:hAnsiTheme="minorAscii"/>
+          <w:b w:val="0"/>
+          <w:bCs w:val="0"/>
+          <w:sz w:val="20"/>
+          <w:szCs w:val="20"/>
+        </w:rPr>
+        <w:t>{% if outstanding_tasks %}{% for task in outstanding_tasks %}</w:t>
+      </w:r>
+    </w:p>
+    <w:p>
+      <w:pPr>
+        <w:pStyle w:val="Normal"/>
+      </w:pPr>
+      <w:r>
+        <w:rPr>
+          <w:rFonts w:ascii="Calibri" w:hAnsi="Calibri" w:asciiTheme="minorAscii" w:hAnsiTheme="minorAscii"/>
+          <w:b w:val="0"/>
+          <w:bCs w:val="0"/>
+          <w:sz w:val="20"/>
+          <w:szCs w:val="20"/>
+        </w:rPr>
+        <w:t>&gt; {{ task }}</w:t>
+      </w:r>
+    </w:p>
+    <w:p>
+      <w:pPr>
+        <w:pStyle w:val="Normal"/>
+      </w:pPr>
+      <w:r>
+        <w:rPr>
+          <w:rFonts w:ascii="Calibri" w:hAnsi="Calibri" w:asciiTheme="minorAscii" w:hAnsiTheme="minorAscii"/>
+          <w:b w:val="0"/>
+          <w:bCs w:val="0"/>
+          <w:sz w:val="20"/>
+          <w:szCs w:val="20"/>
+        </w:rPr>
+        <w:t>{% endfor %}{% else %}</w:t>
+      </w:r>
+    </w:p>
+    <w:p>
+      <w:pPr>
+        <w:pStyle w:val="Normal"/>
+      </w:pPr>
+      <w:r>
+        <w:rPr>
+          <w:rFonts w:ascii="Calibri" w:hAnsi="Calibri" w:asciiTheme="minorAscii" w:hAnsiTheme="minorAscii"/>
+          <w:b w:val="0"/>
+          <w:bCs w:val="0"/>
+          <w:sz w:val="20"/>
+          <w:szCs w:val="20"/>
+        </w:rPr>
+        <w:t>No outstanding actions.</w:t>
       </w:r>
     </w:p>
     <w:p>

</xml_diff>